<commit_message>
feat: add native swiping tabs and document current OCR flow
</commit_message>
<xml_diff>
--- a/docs/吃了么_产品需求文档_PRD.docx
+++ b/docs/吃了么_产品需求文档_PRD.docx
@@ -986,18 +986,8 @@
             </w:tcBorders>
           </w:tcPr>
           <w:p>
-            <w:pPr>
-              <w:spacing w:after="40" w:before="40"/>
-            </w:pPr>
-            <w:r/>
             <w:r>
-              <w:rPr>
-                <w:rFonts w:ascii="Microsoft YaHei" w:hAnsi="Microsoft YaHei" w:eastAsia="Microsoft YaHei"/>
-                <w:b w:val="0"/>
-                <w:color w:val="000000"/>
-                <w:sz w:val="17"/>
-              </w:rPr>
-              <w:t>意图解析、候选 ID 重排、最终回复、视觉菜单识别</w:t>
+              <w:t>??????? ID ????????OCR ????????????</w:t>
             </w:r>
           </w:p>
         </w:tc>
@@ -1016,18 +1006,40 @@
             </w:tcBorders>
           </w:tcPr>
           <w:p>
-            <w:pPr>
-              <w:spacing w:after="40" w:before="40"/>
-            </w:pPr>
-            <w:r/>
             <w:r>
-              <w:rPr>
-                <w:rFonts w:ascii="Microsoft YaHei" w:hAnsi="Microsoft YaHei" w:eastAsia="Microsoft YaHei"/>
-                <w:b w:val="0"/>
-                <w:color w:val="000000"/>
-                <w:sz w:val="17"/>
-              </w:rPr>
-              <w:t>规则、SQLite 和端侧 OCR 继续提供可验证降级</w:t>
+              <w:t>???????????SQLite ? OCR ??????????</w:t>
+            </w:r>
+          </w:p>
+        </w:tc>
+      </w:tr>
+      <w:tr>
+        <w:tc>
+          <w:tcPr>
+            <w:tcW w:type="dxa" w:w="3312"/>
+          </w:tcPr>
+          <w:p>
+            <w:r>
+              <w:t>?? OCR</w:t>
+            </w:r>
+          </w:p>
+        </w:tc>
+        <w:tc>
+          <w:tcPr>
+            <w:tcW w:type="dxa" w:w="3312"/>
+          </w:tcPr>
+          <w:p>
+            <w:r>
+              <w:t>???????????????????????????</w:t>
+            </w:r>
+          </w:p>
+        </w:tc>
+        <w:tc>
+          <w:tcPr>
+            <w:tcW w:type="dxa" w:w="3312"/>
+          </w:tcPr>
+          <w:p>
+            <w:r>
+              <w:t>???????????????? OCR????????????</w:t>
             </w:r>
           </w:p>
         </w:tc>
@@ -4600,18 +4612,8 @@
             </w:tcBorders>
           </w:tcPr>
           <w:p>
-            <w:pPr>
-              <w:spacing w:after="40" w:before="40"/>
-            </w:pPr>
-            <w:r/>
             <w:r>
-              <w:rPr>
-                <w:rFonts w:ascii="Microsoft YaHei" w:hAnsi="Microsoft YaHei" w:eastAsia="Microsoft YaHei"/>
-                <w:b w:val="0"/>
-                <w:color w:val="000000"/>
-                <w:sz w:val="17"/>
-              </w:rPr>
-              <w:t>33 项全部通过</w:t>
+              <w:t>36 ?????</w:t>
             </w:r>
           </w:p>
         </w:tc>
@@ -4704,6 +4706,70 @@
                 <w:sz w:val="17"/>
               </w:rPr>
               <w:t>已通过</w:t>
+            </w:r>
+          </w:p>
+        </w:tc>
+      </w:tr>
+      <w:tr>
+        <w:tc>
+          <w:tcPr>
+            <w:tcW w:type="dxa" w:w="3312"/>
+          </w:tcPr>
+          <w:p>
+            <w:r>
+              <w:t>AC-10</w:t>
+            </w:r>
+          </w:p>
+        </w:tc>
+        <w:tc>
+          <w:tcPr>
+            <w:tcW w:type="dxa" w:w="3312"/>
+          </w:tcPr>
+          <w:p>
+            <w:r>
+              <w:t>?? OCR ???GPT ?????????????</w:t>
+            </w:r>
+          </w:p>
+        </w:tc>
+        <w:tc>
+          <w:tcPr>
+            <w:tcW w:type="dxa" w:w="3312"/>
+          </w:tcPr>
+          <w:p>
+            <w:r>
+              <w:t>??????????????</w:t>
+            </w:r>
+          </w:p>
+        </w:tc>
+      </w:tr>
+      <w:tr>
+        <w:tc>
+          <w:tcPr>
+            <w:tcW w:type="dxa" w:w="3312"/>
+          </w:tcPr>
+          <w:p>
+            <w:r>
+              <w:t>AC-11</w:t>
+            </w:r>
+          </w:p>
+        </w:tc>
+        <w:tc>
+          <w:tcPr>
+            <w:tcW w:type="dxa" w:w="3312"/>
+          </w:tcPr>
+          <w:p>
+            <w:r>
+              <w:t>??????????????? Swiper ????</w:t>
+            </w:r>
+          </w:p>
+        </w:tc>
+        <w:tc>
+          <w:tcPr>
+            <w:tcW w:type="dxa" w:w="3312"/>
+          </w:tcPr>
+          <w:p>
+            <w:r>
+              <w:t>???????????????????</w:t>
             </w:r>
           </w:p>
         </w:tc>

</xml_diff>